<commit_message>
Various radar chart fixes
</commit_message>
<xml_diff>
--- a/tests/fixtures/cases/case31/input.docx
+++ b/tests/fixtures/cases/case31/input.docx
@@ -24350,7 +24350,7 @@
             <a:noFill/>
             <a:ln w="25400">
               <a:solidFill>
-                <a:srgbClr val="4472C4"/>
+                <a:srgbClr val="4F81BD"/>
               </a:solidFill>
             </a:ln>
           </c:spPr>
@@ -24420,7 +24420,7 @@
             <a:noFill/>
             <a:ln w="25400">
               <a:solidFill>
-                <a:srgbClr val="ED7D31"/>
+                <a:srgbClr val="C0504D"/>
               </a:solidFill>
             </a:ln>
           </c:spPr>
@@ -24490,7 +24490,7 @@
             <a:noFill/>
             <a:ln w="25400">
               <a:solidFill>
-                <a:srgbClr val="A5A5A5"/>
+                <a:srgbClr val="9BBB59"/>
               </a:solidFill>
             </a:ln>
           </c:spPr>

</xml_diff>